<commit_message>
docs(thesis): add spacing before "Anno accademico" on the title page
Two blank paragraphs before the "Anno accademico 2025/2026" line, per
the user's request. The edit had been made directly in build/thesis.docx
(build output, discarded on every make) instead of thesis/titlepage.docx
(the real, tracked source) -- ported across by diffing the two documents'
frontispiece paragraphs and inserting the same two paragraph blocks at
the matching position in titlepage.docx, then rebuilding from a clean
`make clean && make` to confirm the direct edit didn't silently survive.

thesis.docx rebuilt: still 65 pages, TOC entries still match their actual
pages exactly.

Co-Authored-By: Claude Sonnet 5 <noreply@anthropic.com>
</commit_message>
<xml_diff>
--- a/thesis/titlepage.docx
+++ b/thesis/titlepage.docx
@@ -315,6 +315,38 @@
       <w:r>
         <w:rPr/>
         <w:t>Jacopo Chergui</w:t>
+      </w:r>
+    </w:p>
+    <w:p>
+      <w:pPr>
+        <w:pStyle w:val="BodyText"/>
+        <w:jc w:val="center"/>
+        <w:rPr>
+          <w:b/>
+          <w:bCs/>
+        </w:rPr>
+      </w:pPr>
+      <w:r>
+        <w:rPr>
+          <w:b/>
+          <w:bCs/>
+        </w:rPr>
+      </w:r>
+    </w:p>
+    <w:p>
+      <w:pPr>
+        <w:pStyle w:val="BodyText"/>
+        <w:jc w:val="center"/>
+        <w:rPr>
+          <w:b/>
+          <w:bCs/>
+        </w:rPr>
+      </w:pPr>
+      <w:r>
+        <w:rPr>
+          <w:b/>
+          <w:bCs/>
+        </w:rPr>
       </w:r>
     </w:p>
     <w:p>

</xml_diff>